<commit_message>
Code changes for workfolio
</commit_message>
<xml_diff>
--- a/public/resume/SumitJangid_SFCC_Resume_2026.docx
+++ b/public/resume/SumitJangid_SFCC_Resume_2026.docx
@@ -1230,6 +1230,14 @@
           <w:tbl>
             <w:tblPr>
               <w:tblW w:w="0" w:type="auto"/>
+              <w:tblBorders>
+                <w:top w:val="nil"/>
+                <w:left w:val="nil"/>
+                <w:bottom w:val="nil"/>
+                <w:right w:val="nil"/>
+                <w:insideH w:val="nil"/>
+                <w:insideV w:val="nil"/>
+              </w:tblBorders>
               <w:tblLook w:val="04A0" w:firstRow="1" w:lastRow="0" w:firstColumn="1" w:lastColumn="0" w:noHBand="0" w:noVBand="1"/>
               <w:tblBorders>
                 <w:top w:val="nil"/>
@@ -1626,53 +1634,6 @@
                       <w:lang w:eastAsia="en-US" w:bidi="ar-SA"/>
                     </w:rPr>
                     <w:t>Uniqlo</w:t>
-                  </w:r>
-                  <w:r>
-                    <w:br/>
-                  </w:r>
-                </w:p>
-              </w:tc>
-            </w:tr>
-            <w:tr wp14:textId="77777777">
-              <w:tc>
-                <w:tcPr>
-                  <w:tcW w:w="4320" w:type="dxa"/>
-                  <w:tcBorders>
-                    <w:bottom w:val="dotted" w:color="CFCFCF" w:sz="4"/>
-                  </w:tcBorders>
-                  <w:tcMar/>
-                  <w:vAlign w:val="center"/>
-                  <w:tcBorders>
-                    <w:bottom w:val="dotted" w:color="CFCFCF" w:sz="4"/>
-                  </w:tcBorders>
-                </w:tcPr>
-                <w:p wp14:textId="658CECA6">
-                  <w:pPr>
-                    <w:spacing w:before="0" w:after="0"/>
-                    <w:rPr>
-                      <w:rFonts w:ascii="Calibri" w:hAnsi="Calibri" w:eastAsia="Calibri"/>
-                      <w:b w:val="0"/>
-                      <w:bCs w:val="0"/>
-                      <w:i w:val="0"/>
-                      <w:iCs w:val="0"/>
-                      <w:color w:val="333333"/>
-                      <w:sz w:val="16"/>
-                      <w:szCs w:val="16"/>
-                    </w:rPr>
-                  </w:pPr>
-                  <w:r>
-                    <w:rPr>
-                      <w:rFonts w:ascii="Calibri" w:hAnsi="Calibri" w:eastAsia="Calibri" w:cs="" w:asciiTheme="minorAscii" w:hAnsiTheme="minorAscii" w:eastAsiaTheme="minorEastAsia" w:cstheme="minorBidi"/>
-                      <w:b w:val="0"/>
-                      <w:bCs w:val="0"/>
-                      <w:i w:val="0"/>
-                      <w:iCs w:val="0"/>
-                      <w:color w:val="333333"/>
-                      <w:sz w:val="16"/>
-                      <w:szCs w:val="16"/>
-                      <w:lang w:eastAsia="en-US" w:bidi="ar-SA"/>
-                    </w:rPr>
-                    <w:t>FullBeauty</w:t>
                   </w:r>
                   <w:r>
                     <w:br/>

</xml_diff>